<commit_message>
Update speaker summaries header title and colour
Co-Authored-By: Claude Opus 5.5 <noreply@anthropic.com>
Claude-Session: https://claude.ai/code/session_01AWLX4QpbYvuRLUtKrb9Hyn
</commit_message>
<xml_diff>
--- a/deliverables/MHR_WOW26_Speaker_Summaries.docx
+++ b/deliverables/MHR_WOW26_Speaker_Summaries.docx
@@ -17,7 +17,7 @@
           <w:sz w:val="34"/>
           <w:szCs w:val="34"/>
         </w:rPr>
-        <w:t xml:space="preserve">MHR WOW 26: What Each Speaker Said</w:t>
+        <w:t xml:space="preserve">MHR WOW 26 Speaker Summaries</w:t>
       </w:r>
     </w:p>
     <w:p>
@@ -29,11 +29,11 @@
       <w:r>
         <w:rPr>
           <w:rFonts w:ascii="Aptos" w:cs="Aptos" w:eastAsia="Aptos" w:hAnsi="Aptos"/>
-          <w:color w:val="FFC000"/>
+          <w:color w:val="FFFFFF"/>
           <w:sz w:val="19"/>
           <w:szCs w:val="19"/>
         </w:rPr>
-        <w:t xml:space="preserve">In plain English  |  Conference: 23 September 2026  |  Khafayah Abdulsalam, Head of Payroll</w:t>
+        <w:t xml:space="preserve">23 September 2026  |  Khafayah Abdulsalam, Head of Payroll</w:t>
       </w:r>
     </w:p>
     <w:p>

</xml_diff>

<commit_message>
Add visible title and more spacing to speaker summaries
Co-Authored-By: Claude Opus 5.5 <noreply@anthropic.com>
Claude-Session: https://claude.ai/code/session_01AWLX4QpbYvuRLUtKrb9Hyn
</commit_message>
<xml_diff>
--- a/deliverables/MHR_WOW26_Speaker_Summaries.docx
+++ b/deliverables/MHR_WOW26_Speaker_Summaries.docx
@@ -4,58 +4,57 @@
   <w:body>
     <w:p>
       <w:pPr>
-        <w:shd w:fill="3D315D" w:color="auto" w:val="clear"/>
-        <w:spacing w:after="0"/>
-        <w:ind w:left="120" w:right="120"/>
-      </w:pPr>
-      <w:r>
-        <w:rPr>
-          <w:rFonts w:ascii="Aptos" w:cs="Aptos" w:eastAsia="Aptos" w:hAnsi="Aptos"/>
-          <w:b/>
-          <w:bCs/>
-          <w:color w:val="FFFFFF"/>
-          <w:sz w:val="34"/>
-          <w:szCs w:val="34"/>
+        <w:spacing w:after="60"/>
+      </w:pPr>
+      <w:r>
+        <w:rPr>
+          <w:rFonts w:ascii="Aptos" w:cs="Aptos" w:eastAsia="Aptos" w:hAnsi="Aptos"/>
+          <w:b/>
+          <w:bCs/>
+          <w:color w:val="3D315D"/>
+          <w:sz w:val="44"/>
+          <w:szCs w:val="44"/>
         </w:rPr>
         <w:t xml:space="preserve">MHR WOW 26 Speaker Summaries</w:t>
       </w:r>
     </w:p>
     <w:p>
       <w:pPr>
-        <w:shd w:fill="3D315D" w:color="auto" w:val="clear"/>
-        <w:spacing w:after="160"/>
-        <w:ind w:left="120" w:right="120"/>
-      </w:pPr>
-      <w:r>
-        <w:rPr>
-          <w:rFonts w:ascii="Aptos" w:cs="Aptos" w:eastAsia="Aptos" w:hAnsi="Aptos"/>
-          <w:color w:val="FFFFFF"/>
-          <w:sz w:val="19"/>
-          <w:szCs w:val="19"/>
-        </w:rPr>
-        <w:t xml:space="preserve">23 September 2026  |  Khafayah Abdulsalam, Head of Payroll</w:t>
-      </w:r>
-    </w:p>
-    <w:p>
-      <w:pPr>
-        <w:spacing w:after="60"/>
-      </w:pPr>
-      <w:r>
-        <w:rPr>
-          <w:rFonts w:ascii="Aptos" w:cs="Aptos" w:eastAsia="Aptos" w:hAnsi="Aptos"/>
-          <w:b/>
-          <w:bCs/>
-          <w:color w:val="3D315D"/>
-          <w:sz w:val="21"/>
-          <w:szCs w:val="21"/>
+        <w:pBdr>
+          <w:bottom w:val="single" w:color="DF5694" w:sz="18" w:space="6"/>
+        </w:pBdr>
+        <w:spacing w:after="240"/>
+      </w:pPr>
+      <w:r>
+        <w:rPr>
+          <w:rFonts w:ascii="Aptos" w:cs="Aptos" w:eastAsia="Aptos" w:hAnsi="Aptos"/>
+          <w:color w:val="66609B"/>
+          <w:sz w:val="22"/>
+          <w:szCs w:val="22"/>
+        </w:rPr>
+        <w:t xml:space="preserve">23 September 2026  |  Khafayah Abdulsalam, Head of Payroll, Hakim Group</w:t>
+      </w:r>
+    </w:p>
+    <w:p>
+      <w:pPr>
+        <w:spacing w:after="80"/>
+      </w:pPr>
+      <w:r>
+        <w:rPr>
+          <w:rFonts w:ascii="Aptos" w:cs="Aptos" w:eastAsia="Aptos" w:hAnsi="Aptos"/>
+          <w:b/>
+          <w:bCs/>
+          <w:color w:val="3D315D"/>
+          <w:sz w:val="22"/>
+          <w:szCs w:val="22"/>
         </w:rPr>
         <w:t xml:space="preserve">Quick guide: </w:t>
       </w:r>
       <w:r>
         <w:rPr>
           <w:rFonts w:ascii="Aptos" w:cs="Aptos" w:eastAsia="Aptos" w:hAnsi="Aptos"/>
-          <w:sz w:val="21"/>
-          <w:szCs w:val="21"/>
+          <w:sz w:val="22"/>
+          <w:szCs w:val="22"/>
         </w:rPr>
         <w:t xml:space="preserve">AI means computer tools that learn and help with tasks, like ChatGPT. iTrent is our payroll and HR system, made by MHR.</w:t>
       </w:r>
@@ -66,7 +65,7 @@
         <w:pBdr>
           <w:bottom w:val="single" w:color="DF5694" w:sz="10" w:space="2"/>
         </w:pBdr>
-        <w:spacing w:after="30" w:before="140"/>
+        <w:spacing w:after="80" w:before="300"/>
       </w:pPr>
       <w:r>
         <w:rPr>
@@ -96,13 +95,13 @@
           <w:ilvl w:val="0"/>
           <w:numId w:val="2"/>
         </w:numPr>
-        <w:spacing w:after="10"/>
-      </w:pPr>
-      <w:r>
-        <w:rPr>
-          <w:rFonts w:ascii="Aptos" w:cs="Aptos" w:eastAsia="Aptos" w:hAnsi="Aptos"/>
-          <w:sz w:val="21"/>
-          <w:szCs w:val="21"/>
+        <w:spacing w:after="50"/>
+      </w:pPr>
+      <w:r>
+        <w:rPr>
+          <w:rFonts w:ascii="Aptos" w:cs="Aptos" w:eastAsia="Aptos" w:hAnsi="Aptos"/>
+          <w:sz w:val="22"/>
+          <w:szCs w:val="22"/>
         </w:rPr>
         <w:t xml:space="preserve">He showed a simple way to think about the future.</w:t>
       </w:r>
@@ -114,13 +113,13 @@
           <w:ilvl w:val="0"/>
           <w:numId w:val="2"/>
         </w:numPr>
-        <w:spacing w:after="10"/>
-      </w:pPr>
-      <w:r>
-        <w:rPr>
-          <w:rFonts w:ascii="Aptos" w:cs="Aptos" w:eastAsia="Aptos" w:hAnsi="Aptos"/>
-          <w:sz w:val="21"/>
-          <w:szCs w:val="21"/>
+        <w:spacing w:after="50"/>
+      </w:pPr>
+      <w:r>
+        <w:rPr>
+          <w:rFonts w:ascii="Aptos" w:cs="Aptos" w:eastAsia="Aptos" w:hAnsi="Aptos"/>
+          <w:sz w:val="22"/>
+          <w:szCs w:val="22"/>
         </w:rPr>
         <w:t xml:space="preserve">First, list the big changes in the world. For example, people are living longer.</w:t>
       </w:r>
@@ -132,13 +131,13 @@
           <w:ilvl w:val="0"/>
           <w:numId w:val="2"/>
         </w:numPr>
-        <w:spacing w:after="10"/>
-      </w:pPr>
-      <w:r>
-        <w:rPr>
-          <w:rFonts w:ascii="Aptos" w:cs="Aptos" w:eastAsia="Aptos" w:hAnsi="Aptos"/>
-          <w:sz w:val="21"/>
-          <w:szCs w:val="21"/>
+        <w:spacing w:after="50"/>
+      </w:pPr>
+      <w:r>
+        <w:rPr>
+          <w:rFonts w:ascii="Aptos" w:cs="Aptos" w:eastAsia="Aptos" w:hAnsi="Aptos"/>
+          <w:sz w:val="22"/>
+          <w:szCs w:val="22"/>
         </w:rPr>
         <w:t xml:space="preserve">Next, list the new ideas and new tools, such as AI.</w:t>
       </w:r>
@@ -150,13 +149,13 @@
           <w:ilvl w:val="0"/>
           <w:numId w:val="2"/>
         </w:numPr>
-        <w:spacing w:after="10"/>
-      </w:pPr>
-      <w:r>
-        <w:rPr>
-          <w:rFonts w:ascii="Aptos" w:cs="Aptos" w:eastAsia="Aptos" w:hAnsi="Aptos"/>
-          <w:sz w:val="21"/>
-          <w:szCs w:val="21"/>
+        <w:spacing w:after="50"/>
+      </w:pPr>
+      <w:r>
+        <w:rPr>
+          <w:rFonts w:ascii="Aptos" w:cs="Aptos" w:eastAsia="Aptos" w:hAnsi="Aptos"/>
+          <w:sz w:val="22"/>
+          <w:szCs w:val="22"/>
         </w:rPr>
         <w:t xml:space="preserve">Then look at where the two meet. That is where the future starts.</w:t>
       </w:r>
@@ -167,7 +166,7 @@
           <w:left w:val="single" w:color="DF5694" w:sz="24" w:space="4"/>
         </w:pBdr>
         <w:shd w:fill="FBE1EC" w:color="auto" w:val="clear"/>
-        <w:spacing w:after="20" w:before="40"/>
+        <w:spacing w:after="40" w:before="100"/>
         <w:ind w:left="120" w:right="120"/>
       </w:pPr>
       <w:r>
@@ -176,16 +175,16 @@
           <w:b/>
           <w:bCs/>
           <w:color w:val="3D315D"/>
-          <w:sz w:val="21"/>
-          <w:szCs w:val="21"/>
+          <w:sz w:val="22"/>
+          <w:szCs w:val="22"/>
         </w:rPr>
         <w:t xml:space="preserve">What this means for us: </w:t>
       </w:r>
       <w:r>
         <w:rPr>
           <w:rFonts w:ascii="Aptos" w:cs="Aptos" w:eastAsia="Aptos" w:hAnsi="Aptos"/>
-          <w:sz w:val="21"/>
-          <w:szCs w:val="21"/>
+          <w:sz w:val="22"/>
+          <w:szCs w:val="22"/>
         </w:rPr>
         <w:t xml:space="preserve">We should use this simple method when we plan our teams.</w:t>
       </w:r>
@@ -196,7 +195,7 @@
         <w:pBdr>
           <w:bottom w:val="single" w:color="DF5694" w:sz="10" w:space="2"/>
         </w:pBdr>
-        <w:spacing w:after="30" w:before="140"/>
+        <w:spacing w:after="80" w:before="300"/>
       </w:pPr>
       <w:r>
         <w:rPr>
@@ -226,13 +225,13 @@
           <w:ilvl w:val="0"/>
           <w:numId w:val="2"/>
         </w:numPr>
-        <w:spacing w:after="10"/>
-      </w:pPr>
-      <w:r>
-        <w:rPr>
-          <w:rFonts w:ascii="Aptos" w:cs="Aptos" w:eastAsia="Aptos" w:hAnsi="Aptos"/>
-          <w:sz w:val="21"/>
-          <w:szCs w:val="21"/>
+        <w:spacing w:after="50"/>
+      </w:pPr>
+      <w:r>
+        <w:rPr>
+          <w:rFonts w:ascii="Aptos" w:cs="Aptos" w:eastAsia="Aptos" w:hAnsi="Aptos"/>
+          <w:sz w:val="22"/>
+          <w:szCs w:val="22"/>
         </w:rPr>
         <w:t xml:space="preserve">iTrent is the system we use to pay our staff.</w:t>
       </w:r>
@@ -244,13 +243,13 @@
           <w:ilvl w:val="0"/>
           <w:numId w:val="2"/>
         </w:numPr>
-        <w:spacing w:after="10"/>
-      </w:pPr>
-      <w:r>
-        <w:rPr>
-          <w:rFonts w:ascii="Aptos" w:cs="Aptos" w:eastAsia="Aptos" w:hAnsi="Aptos"/>
-          <w:sz w:val="21"/>
-          <w:szCs w:val="21"/>
+        <w:spacing w:after="50"/>
+      </w:pPr>
+      <w:r>
+        <w:rPr>
+          <w:rFonts w:ascii="Aptos" w:cs="Aptos" w:eastAsia="Aptos" w:hAnsi="Aptos"/>
+          <w:sz w:val="22"/>
+          <w:szCs w:val="22"/>
         </w:rPr>
         <w:t xml:space="preserve">MHR confirmed iTrent is here to stay, and they will keep improving it.</w:t>
       </w:r>
@@ -262,13 +261,13 @@
           <w:ilvl w:val="0"/>
           <w:numId w:val="2"/>
         </w:numPr>
-        <w:spacing w:after="10"/>
-      </w:pPr>
-      <w:r>
-        <w:rPr>
-          <w:rFonts w:ascii="Aptos" w:cs="Aptos" w:eastAsia="Aptos" w:hAnsi="Aptos"/>
-          <w:sz w:val="21"/>
-          <w:szCs w:val="21"/>
+        <w:spacing w:after="50"/>
+      </w:pPr>
+      <w:r>
+        <w:rPr>
+          <w:rFonts w:ascii="Aptos" w:cs="Aptos" w:eastAsia="Aptos" w:hAnsi="Aptos"/>
+          <w:sz w:val="22"/>
+          <w:szCs w:val="22"/>
         </w:rPr>
         <w:t xml:space="preserve">They are adding four new tools: one for expenses, one for staff skills, an AI helper you chat to, and one for finance.</w:t>
       </w:r>
@@ -280,13 +279,13 @@
           <w:ilvl w:val="0"/>
           <w:numId w:val="2"/>
         </w:numPr>
-        <w:spacing w:after="10"/>
-      </w:pPr>
-      <w:r>
-        <w:rPr>
-          <w:rFonts w:ascii="Aptos" w:cs="Aptos" w:eastAsia="Aptos" w:hAnsi="Aptos"/>
-          <w:sz w:val="21"/>
-          <w:szCs w:val="21"/>
+        <w:spacing w:after="50"/>
+      </w:pPr>
+      <w:r>
+        <w:rPr>
+          <w:rFonts w:ascii="Aptos" w:cs="Aptos" w:eastAsia="Aptos" w:hAnsi="Aptos"/>
+          <w:sz w:val="22"/>
+          <w:szCs w:val="22"/>
         </w:rPr>
         <w:t xml:space="preserve">In the demo, the system spotted problems early, such as too much overtime, before anyone asked.</w:t>
       </w:r>
@@ -297,7 +296,7 @@
           <w:left w:val="single" w:color="DF5694" w:sz="24" w:space="4"/>
         </w:pBdr>
         <w:shd w:fill="FBE1EC" w:color="auto" w:val="clear"/>
-        <w:spacing w:after="20" w:before="40"/>
+        <w:spacing w:after="40" w:before="100"/>
         <w:ind w:left="120" w:right="120"/>
       </w:pPr>
       <w:r>
@@ -306,16 +305,16 @@
           <w:b/>
           <w:bCs/>
           <w:color w:val="3D315D"/>
-          <w:sz w:val="21"/>
-          <w:szCs w:val="21"/>
+          <w:sz w:val="22"/>
+          <w:szCs w:val="22"/>
         </w:rPr>
         <w:t xml:space="preserve">What this means for us: </w:t>
       </w:r>
       <w:r>
         <w:rPr>
           <w:rFonts w:ascii="Aptos" w:cs="Aptos" w:eastAsia="Aptos" w:hAnsi="Aptos"/>
-          <w:sz w:val="21"/>
-          <w:szCs w:val="21"/>
+          <w:sz w:val="22"/>
+          <w:szCs w:val="22"/>
         </w:rPr>
         <w:t xml:space="preserve">Our iTrent system is safe. We should look at which new tools would help us.</w:t>
       </w:r>
@@ -326,7 +325,7 @@
         <w:pBdr>
           <w:bottom w:val="single" w:color="DF5694" w:sz="10" w:space="2"/>
         </w:pBdr>
-        <w:spacing w:after="30" w:before="140"/>
+        <w:spacing w:after="80" w:before="300"/>
       </w:pPr>
       <w:r>
         <w:rPr>
@@ -356,13 +355,13 @@
           <w:ilvl w:val="0"/>
           <w:numId w:val="2"/>
         </w:numPr>
-        <w:spacing w:after="10"/>
-      </w:pPr>
-      <w:r>
-        <w:rPr>
-          <w:rFonts w:ascii="Aptos" w:cs="Aptos" w:eastAsia="Aptos" w:hAnsi="Aptos"/>
-          <w:sz w:val="21"/>
-          <w:szCs w:val="21"/>
+        <w:spacing w:after="50"/>
+      </w:pPr>
+      <w:r>
+        <w:rPr>
+          <w:rFonts w:ascii="Aptos" w:cs="Aptos" w:eastAsia="Aptos" w:hAnsi="Aptos"/>
+          <w:sz w:val="22"/>
+          <w:szCs w:val="22"/>
         </w:rPr>
         <w:t xml:space="preserve">AI is very good at some jobs and very poor at others. A person must always check its work.</w:t>
       </w:r>
@@ -374,13 +373,13 @@
           <w:ilvl w:val="0"/>
           <w:numId w:val="2"/>
         </w:numPr>
-        <w:spacing w:after="10"/>
-      </w:pPr>
-      <w:r>
-        <w:rPr>
-          <w:rFonts w:ascii="Aptos" w:cs="Aptos" w:eastAsia="Aptos" w:hAnsi="Aptos"/>
-          <w:sz w:val="21"/>
-          <w:szCs w:val="21"/>
+        <w:spacing w:after="50"/>
+      </w:pPr>
+      <w:r>
+        <w:rPr>
+          <w:rFonts w:ascii="Aptos" w:cs="Aptos" w:eastAsia="Aptos" w:hAnsi="Aptos"/>
+          <w:sz w:val="22"/>
+          <w:szCs w:val="22"/>
         </w:rPr>
         <w:t xml:space="preserve">A hotel swapped its doorman for an automatic door. It saved money, but guests felt less welcome. The doorman did more than open doors.</w:t>
       </w:r>
@@ -392,13 +391,13 @@
           <w:ilvl w:val="0"/>
           <w:numId w:val="2"/>
         </w:numPr>
-        <w:spacing w:after="10"/>
-      </w:pPr>
-      <w:r>
-        <w:rPr>
-          <w:rFonts w:ascii="Aptos" w:cs="Aptos" w:eastAsia="Aptos" w:hAnsi="Aptos"/>
-          <w:sz w:val="21"/>
-          <w:szCs w:val="21"/>
+        <w:spacing w:after="50"/>
+      </w:pPr>
+      <w:r>
+        <w:rPr>
+          <w:rFonts w:ascii="Aptos" w:cs="Aptos" w:eastAsia="Aptos" w:hAnsi="Aptos"/>
+          <w:sz w:val="22"/>
+          <w:szCs w:val="22"/>
         </w:rPr>
         <w:t xml:space="preserve">In a beehive, most bees go to flowers they know. A few bees explore for new ones. Without the explorers, the hive would run out of food.</w:t>
       </w:r>
@@ -410,13 +409,13 @@
           <w:ilvl w:val="0"/>
           <w:numId w:val="2"/>
         </w:numPr>
-        <w:spacing w:after="10"/>
-      </w:pPr>
-      <w:r>
-        <w:rPr>
-          <w:rFonts w:ascii="Aptos" w:cs="Aptos" w:eastAsia="Aptos" w:hAnsi="Aptos"/>
-          <w:sz w:val="21"/>
-          <w:szCs w:val="21"/>
+        <w:spacing w:after="50"/>
+      </w:pPr>
+      <w:r>
+        <w:rPr>
+          <w:rFonts w:ascii="Aptos" w:cs="Aptos" w:eastAsia="Aptos" w:hAnsi="Aptos"/>
+          <w:sz w:val="22"/>
+          <w:szCs w:val="22"/>
         </w:rPr>
         <w:t xml:space="preserve">Payroll does vital work, but people only notice it when something goes wrong.</w:t>
       </w:r>
@@ -427,7 +426,7 @@
           <w:left w:val="single" w:color="DF5694" w:sz="24" w:space="4"/>
         </w:pBdr>
         <w:shd w:fill="FBE1EC" w:color="auto" w:val="clear"/>
-        <w:spacing w:after="20" w:before="40"/>
+        <w:spacing w:after="40" w:before="100"/>
         <w:ind w:left="120" w:right="120"/>
       </w:pPr>
       <w:r>
@@ -436,16 +435,16 @@
           <w:b/>
           <w:bCs/>
           <w:color w:val="3D315D"/>
-          <w:sz w:val="21"/>
-          <w:szCs w:val="21"/>
+          <w:sz w:val="22"/>
+          <w:szCs w:val="22"/>
         </w:rPr>
         <w:t xml:space="preserve">What this means for us: </w:t>
       </w:r>
       <w:r>
         <w:rPr>
           <w:rFonts w:ascii="Aptos" w:cs="Aptos" w:eastAsia="Aptos" w:hAnsi="Aptos"/>
-          <w:sz w:val="21"/>
-          <w:szCs w:val="21"/>
+          <w:sz w:val="22"/>
+          <w:szCs w:val="22"/>
         </w:rPr>
         <w:t xml:space="preserve">Before we replace any job with AI, we should list all the good things that person does, not only the tasks on paper.</w:t>
       </w:r>
@@ -456,7 +455,7 @@
         <w:pBdr>
           <w:bottom w:val="single" w:color="DF5694" w:sz="10" w:space="2"/>
         </w:pBdr>
-        <w:spacing w:after="30" w:before="140"/>
+        <w:spacing w:after="80" w:before="300"/>
       </w:pPr>
       <w:r>
         <w:rPr>
@@ -486,13 +485,13 @@
           <w:ilvl w:val="0"/>
           <w:numId w:val="2"/>
         </w:numPr>
-        <w:spacing w:after="10"/>
-      </w:pPr>
-      <w:r>
-        <w:rPr>
-          <w:rFonts w:ascii="Aptos" w:cs="Aptos" w:eastAsia="Aptos" w:hAnsi="Aptos"/>
-          <w:sz w:val="21"/>
-          <w:szCs w:val="21"/>
+        <w:spacing w:after="50"/>
+      </w:pPr>
+      <w:r>
+        <w:rPr>
+          <w:rFonts w:ascii="Aptos" w:cs="Aptos" w:eastAsia="Aptos" w:hAnsi="Aptos"/>
+          <w:sz w:val="22"/>
+          <w:szCs w:val="22"/>
         </w:rPr>
         <w:t xml:space="preserve">His team moved to MHR systems successfully. Three things helped: a team focused only on the project, good teamwork with MHR, and support for staff.</w:t>
       </w:r>
@@ -504,13 +503,13 @@
           <w:ilvl w:val="0"/>
           <w:numId w:val="2"/>
         </w:numPr>
-        <w:spacing w:after="10"/>
-      </w:pPr>
-      <w:r>
-        <w:rPr>
-          <w:rFonts w:ascii="Aptos" w:cs="Aptos" w:eastAsia="Aptos" w:hAnsi="Aptos"/>
-          <w:sz w:val="21"/>
-          <w:szCs w:val="21"/>
+        <w:spacing w:after="50"/>
+      </w:pPr>
+      <w:r>
+        <w:rPr>
+          <w:rFonts w:ascii="Aptos" w:cs="Aptos" w:eastAsia="Aptos" w:hAnsi="Aptos"/>
+          <w:sz w:val="22"/>
+          <w:szCs w:val="22"/>
         </w:rPr>
         <w:t xml:space="preserve">A new system is only a success if staff use it. Going live on time is not enough.</w:t>
       </w:r>
@@ -522,13 +521,13 @@
           <w:ilvl w:val="0"/>
           <w:numId w:val="2"/>
         </w:numPr>
-        <w:spacing w:after="10"/>
-      </w:pPr>
-      <w:r>
-        <w:rPr>
-          <w:rFonts w:ascii="Aptos" w:cs="Aptos" w:eastAsia="Aptos" w:hAnsi="Aptos"/>
-          <w:sz w:val="21"/>
-          <w:szCs w:val="21"/>
+        <w:spacing w:after="50"/>
+      </w:pPr>
+      <w:r>
+        <w:rPr>
+          <w:rFonts w:ascii="Aptos" w:cs="Aptos" w:eastAsia="Aptos" w:hAnsi="Aptos"/>
+          <w:sz w:val="22"/>
+          <w:szCs w:val="22"/>
         </w:rPr>
         <w:t xml:space="preserve">He showed a robot that answered HR questions kindly. But AI still does not understand feelings or build trust like a person.</w:t>
       </w:r>
@@ -539,7 +538,7 @@
           <w:left w:val="single" w:color="DF5694" w:sz="24" w:space="4"/>
         </w:pBdr>
         <w:shd w:fill="FBE1EC" w:color="auto" w:val="clear"/>
-        <w:spacing w:after="20" w:before="40"/>
+        <w:spacing w:after="40" w:before="100"/>
         <w:ind w:left="120" w:right="120"/>
       </w:pPr>
       <w:r>
@@ -548,16 +547,16 @@
           <w:b/>
           <w:bCs/>
           <w:color w:val="3D315D"/>
-          <w:sz w:val="21"/>
-          <w:szCs w:val="21"/>
+          <w:sz w:val="22"/>
+          <w:szCs w:val="22"/>
         </w:rPr>
         <w:t xml:space="preserve">What this means for us: </w:t>
       </w:r>
       <w:r>
         <w:rPr>
           <w:rFonts w:ascii="Aptos" w:cs="Aptos" w:eastAsia="Aptos" w:hAnsi="Aptos"/>
-          <w:sz w:val="21"/>
-          <w:szCs w:val="21"/>
+          <w:sz w:val="22"/>
+          <w:szCs w:val="22"/>
         </w:rPr>
         <w:t xml:space="preserve">We should judge a new system by how many people use it, not by the launch date.</w:t>
       </w:r>
@@ -568,7 +567,7 @@
         <w:pBdr>
           <w:bottom w:val="single" w:color="DF5694" w:sz="10" w:space="2"/>
         </w:pBdr>
-        <w:spacing w:after="30" w:before="140"/>
+        <w:spacing w:after="80" w:before="300"/>
       </w:pPr>
       <w:r>
         <w:rPr>
@@ -598,13 +597,13 @@
           <w:ilvl w:val="0"/>
           <w:numId w:val="2"/>
         </w:numPr>
-        <w:spacing w:after="10"/>
-      </w:pPr>
-      <w:r>
-        <w:rPr>
-          <w:rFonts w:ascii="Aptos" w:cs="Aptos" w:eastAsia="Aptos" w:hAnsi="Aptos"/>
-          <w:sz w:val="21"/>
-          <w:szCs w:val="21"/>
+        <w:spacing w:after="50"/>
+      </w:pPr>
+      <w:r>
+        <w:rPr>
+          <w:rFonts w:ascii="Aptos" w:cs="Aptos" w:eastAsia="Aptos" w:hAnsi="Aptos"/>
+          <w:sz w:val="22"/>
+          <w:szCs w:val="22"/>
         </w:rPr>
         <w:t xml:space="preserve">Most companies are only starting with AI. They use it for small personal tasks.</w:t>
       </w:r>
@@ -616,13 +615,13 @@
           <w:ilvl w:val="0"/>
           <w:numId w:val="2"/>
         </w:numPr>
-        <w:spacing w:after="10"/>
-      </w:pPr>
-      <w:r>
-        <w:rPr>
-          <w:rFonts w:ascii="Aptos" w:cs="Aptos" w:eastAsia="Aptos" w:hAnsi="Aptos"/>
-          <w:sz w:val="21"/>
-          <w:szCs w:val="21"/>
+        <w:spacing w:after="50"/>
+      </w:pPr>
+      <w:r>
+        <w:rPr>
+          <w:rFonts w:ascii="Aptos" w:cs="Aptos" w:eastAsia="Aptos" w:hAnsi="Aptos"/>
+          <w:sz w:val="22"/>
+          <w:szCs w:val="22"/>
         </w:rPr>
         <w:t xml:space="preserve">Many companies cut jobs to use AI. Most did not make more money, and some had to hire people back.</w:t>
       </w:r>
@@ -634,13 +633,13 @@
           <w:ilvl w:val="0"/>
           <w:numId w:val="2"/>
         </w:numPr>
-        <w:spacing w:after="10"/>
-      </w:pPr>
-      <w:r>
-        <w:rPr>
-          <w:rFonts w:ascii="Aptos" w:cs="Aptos" w:eastAsia="Aptos" w:hAnsi="Aptos"/>
-          <w:sz w:val="21"/>
-          <w:szCs w:val="21"/>
+        <w:spacing w:after="50"/>
+      </w:pPr>
+      <w:r>
+        <w:rPr>
+          <w:rFonts w:ascii="Aptos" w:cs="Aptos" w:eastAsia="Aptos" w:hAnsi="Aptos"/>
+          <w:sz w:val="22"/>
+          <w:szCs w:val="22"/>
         </w:rPr>
         <w:t xml:space="preserve">Staff already use AI tools at work. Without clear rules, company data is at risk.</w:t>
       </w:r>
@@ -652,13 +651,13 @@
           <w:ilvl w:val="0"/>
           <w:numId w:val="2"/>
         </w:numPr>
-        <w:spacing w:after="10"/>
-      </w:pPr>
-      <w:r>
-        <w:rPr>
-          <w:rFonts w:ascii="Aptos" w:cs="Aptos" w:eastAsia="Aptos" w:hAnsi="Aptos"/>
-          <w:sz w:val="21"/>
-          <w:szCs w:val="21"/>
+        <w:spacing w:after="50"/>
+      </w:pPr>
+      <w:r>
+        <w:rPr>
+          <w:rFonts w:ascii="Aptos" w:cs="Aptos" w:eastAsia="Aptos" w:hAnsi="Aptos"/>
+          <w:sz w:val="22"/>
+          <w:szCs w:val="22"/>
         </w:rPr>
         <w:t xml:space="preserve">IKEA used AI for customer calls. Instead of cutting 800 staff, they trained them to become interior designers.</w:t>
       </w:r>
@@ -669,7 +668,7 @@
           <w:left w:val="single" w:color="DF5694" w:sz="24" w:space="4"/>
         </w:pBdr>
         <w:shd w:fill="FBE1EC" w:color="auto" w:val="clear"/>
-        <w:spacing w:after="20" w:before="40"/>
+        <w:spacing w:after="40" w:before="100"/>
         <w:ind w:left="120" w:right="120"/>
       </w:pPr>
       <w:r>
@@ -678,16 +677,16 @@
           <w:b/>
           <w:bCs/>
           <w:color w:val="3D315D"/>
-          <w:sz w:val="21"/>
-          <w:szCs w:val="21"/>
+          <w:sz w:val="22"/>
+          <w:szCs w:val="22"/>
         </w:rPr>
         <w:t xml:space="preserve">What this means for us: </w:t>
       </w:r>
       <w:r>
         <w:rPr>
           <w:rFonts w:ascii="Aptos" w:cs="Aptos" w:eastAsia="Aptos" w:hAnsi="Aptos"/>
-          <w:sz w:val="21"/>
-          <w:szCs w:val="21"/>
+          <w:sz w:val="22"/>
+          <w:szCs w:val="22"/>
         </w:rPr>
         <w:t xml:space="preserve">We need clear rules for using AI at work. Every AI project must fix a real problem.</w:t>
       </w:r>
@@ -698,7 +697,7 @@
         <w:pBdr>
           <w:bottom w:val="single" w:color="DF5694" w:sz="10" w:space="2"/>
         </w:pBdr>
-        <w:spacing w:after="30" w:before="140"/>
+        <w:spacing w:after="80" w:before="300"/>
       </w:pPr>
       <w:r>
         <w:rPr>
@@ -728,13 +727,13 @@
           <w:ilvl w:val="0"/>
           <w:numId w:val="2"/>
         </w:numPr>
-        <w:spacing w:after="10"/>
-      </w:pPr>
-      <w:r>
-        <w:rPr>
-          <w:rFonts w:ascii="Aptos" w:cs="Aptos" w:eastAsia="Aptos" w:hAnsi="Aptos"/>
-          <w:sz w:val="21"/>
-          <w:szCs w:val="21"/>
+        <w:spacing w:after="50"/>
+      </w:pPr>
+      <w:r>
+        <w:rPr>
+          <w:rFonts w:ascii="Aptos" w:cs="Aptos" w:eastAsia="Aptos" w:hAnsi="Aptos"/>
+          <w:sz w:val="22"/>
+          <w:szCs w:val="22"/>
         </w:rPr>
         <w:t xml:space="preserve">Staff should feel safe to speak up. Leaders should expect and welcome new ideas.</w:t>
       </w:r>
@@ -746,13 +745,13 @@
           <w:ilvl w:val="0"/>
           <w:numId w:val="2"/>
         </w:numPr>
-        <w:spacing w:after="10"/>
-      </w:pPr>
-      <w:r>
-        <w:rPr>
-          <w:rFonts w:ascii="Aptos" w:cs="Aptos" w:eastAsia="Aptos" w:hAnsi="Aptos"/>
-          <w:sz w:val="21"/>
-          <w:szCs w:val="21"/>
+        <w:spacing w:after="50"/>
+      </w:pPr>
+      <w:r>
+        <w:rPr>
+          <w:rFonts w:ascii="Aptos" w:cs="Aptos" w:eastAsia="Aptos" w:hAnsi="Aptos"/>
+          <w:sz w:val="22"/>
+          <w:szCs w:val="22"/>
         </w:rPr>
         <w:t xml:space="preserve">If a leader says no to an idea, they should explain why.</w:t>
       </w:r>
@@ -764,13 +763,13 @@
           <w:ilvl w:val="0"/>
           <w:numId w:val="2"/>
         </w:numPr>
-        <w:spacing w:after="10"/>
-      </w:pPr>
-      <w:r>
-        <w:rPr>
-          <w:rFonts w:ascii="Aptos" w:cs="Aptos" w:eastAsia="Aptos" w:hAnsi="Aptos"/>
-          <w:sz w:val="21"/>
-          <w:szCs w:val="21"/>
+        <w:spacing w:after="50"/>
+      </w:pPr>
+      <w:r>
+        <w:rPr>
+          <w:rFonts w:ascii="Aptos" w:cs="Aptos" w:eastAsia="Aptos" w:hAnsi="Aptos"/>
+          <w:sz w:val="22"/>
+          <w:szCs w:val="22"/>
         </w:rPr>
         <w:t xml:space="preserve">In meetings, ask junior staff for their views first.</w:t>
       </w:r>
@@ -782,13 +781,13 @@
           <w:ilvl w:val="0"/>
           <w:numId w:val="2"/>
         </w:numPr>
-        <w:spacing w:after="10"/>
-      </w:pPr>
-      <w:r>
-        <w:rPr>
-          <w:rFonts w:ascii="Aptos" w:cs="Aptos" w:eastAsia="Aptos" w:hAnsi="Aptos"/>
-          <w:sz w:val="21"/>
-          <w:szCs w:val="21"/>
+        <w:spacing w:after="50"/>
+      </w:pPr>
+      <w:r>
+        <w:rPr>
+          <w:rFonts w:ascii="Aptos" w:cs="Aptos" w:eastAsia="Aptos" w:hAnsi="Aptos"/>
+          <w:sz w:val="22"/>
+          <w:szCs w:val="22"/>
         </w:rPr>
         <w:t xml:space="preserve">MHR spent 100 days teaching every team about AI. The aim was to help staff see AI as a helper, not a threat.</w:t>
       </w:r>
@@ -799,7 +798,7 @@
           <w:left w:val="single" w:color="DF5694" w:sz="24" w:space="4"/>
         </w:pBdr>
         <w:shd w:fill="FBE1EC" w:color="auto" w:val="clear"/>
-        <w:spacing w:after="20" w:before="40"/>
+        <w:spacing w:after="40" w:before="100"/>
         <w:ind w:left="120" w:right="120"/>
       </w:pPr>
       <w:r>
@@ -808,16 +807,16 @@
           <w:b/>
           <w:bCs/>
           <w:color w:val="3D315D"/>
-          <w:sz w:val="21"/>
-          <w:szCs w:val="21"/>
+          <w:sz w:val="22"/>
+          <w:szCs w:val="22"/>
         </w:rPr>
         <w:t xml:space="preserve">What this means for us: </w:t>
       </w:r>
       <w:r>
         <w:rPr>
           <w:rFonts w:ascii="Aptos" w:cs="Aptos" w:eastAsia="Aptos" w:hAnsi="Aptos"/>
-          <w:sz w:val="21"/>
-          <w:szCs w:val="21"/>
+          <w:sz w:val="22"/>
+          <w:szCs w:val="22"/>
         </w:rPr>
         <w:t xml:space="preserve">In every one-to-one, managers should ask: “What have you helped to improve this year?”</w:t>
       </w:r>
@@ -828,7 +827,7 @@
         <w:pBdr>
           <w:bottom w:val="single" w:color="DF5694" w:sz="10" w:space="2"/>
         </w:pBdr>
-        <w:spacing w:after="30" w:before="140"/>
+        <w:spacing w:after="80" w:before="300"/>
       </w:pPr>
       <w:r>
         <w:rPr>
@@ -858,13 +857,13 @@
           <w:ilvl w:val="0"/>
           <w:numId w:val="2"/>
         </w:numPr>
-        <w:spacing w:after="10"/>
-      </w:pPr>
-      <w:r>
-        <w:rPr>
-          <w:rFonts w:ascii="Aptos" w:cs="Aptos" w:eastAsia="Aptos" w:hAnsi="Aptos"/>
-          <w:sz w:val="21"/>
-          <w:szCs w:val="21"/>
+        <w:spacing w:after="50"/>
+      </w:pPr>
+      <w:r>
+        <w:rPr>
+          <w:rFonts w:ascii="Aptos" w:cs="Aptos" w:eastAsia="Aptos" w:hAnsi="Aptos"/>
+          <w:sz w:val="22"/>
+          <w:szCs w:val="22"/>
         </w:rPr>
         <w:t xml:space="preserve">A good culture protects a company when times are hard.</w:t>
       </w:r>
@@ -876,13 +875,13 @@
           <w:ilvl w:val="0"/>
           <w:numId w:val="2"/>
         </w:numPr>
-        <w:spacing w:after="10"/>
-      </w:pPr>
-      <w:r>
-        <w:rPr>
-          <w:rFonts w:ascii="Aptos" w:cs="Aptos" w:eastAsia="Aptos" w:hAnsi="Aptos"/>
-          <w:sz w:val="21"/>
-          <w:szCs w:val="21"/>
+        <w:spacing w:after="50"/>
+      </w:pPr>
+      <w:r>
+        <w:rPr>
+          <w:rFonts w:ascii="Aptos" w:cs="Aptos" w:eastAsia="Aptos" w:hAnsi="Aptos"/>
+          <w:sz w:val="22"/>
+          <w:szCs w:val="22"/>
         </w:rPr>
         <w:t xml:space="preserve">“You will not lose your job to AI. You will lose it to someone who knows how to use AI.”</w:t>
       </w:r>
@@ -894,13 +893,13 @@
           <w:ilvl w:val="0"/>
           <w:numId w:val="2"/>
         </w:numPr>
-        <w:spacing w:after="10"/>
-      </w:pPr>
-      <w:r>
-        <w:rPr>
-          <w:rFonts w:ascii="Aptos" w:cs="Aptos" w:eastAsia="Aptos" w:hAnsi="Aptos"/>
-          <w:sz w:val="21"/>
-          <w:szCs w:val="21"/>
+        <w:spacing w:after="50"/>
+      </w:pPr>
+      <w:r>
+        <w:rPr>
+          <w:rFonts w:ascii="Aptos" w:cs="Aptos" w:eastAsia="Aptos" w:hAnsi="Aptos"/>
+          <w:sz w:val="22"/>
+          <w:szCs w:val="22"/>
         </w:rPr>
         <w:t xml:space="preserve">Companies should offer apprenticeships and work experience to young people.</w:t>
       </w:r>
@@ -912,13 +911,13 @@
           <w:ilvl w:val="0"/>
           <w:numId w:val="2"/>
         </w:numPr>
-        <w:spacing w:after="10"/>
-      </w:pPr>
-      <w:r>
-        <w:rPr>
-          <w:rFonts w:ascii="Aptos" w:cs="Aptos" w:eastAsia="Aptos" w:hAnsi="Aptos"/>
-          <w:sz w:val="21"/>
-          <w:szCs w:val="21"/>
+        <w:spacing w:after="50"/>
+      </w:pPr>
+      <w:r>
+        <w:rPr>
+          <w:rFonts w:ascii="Aptos" w:cs="Aptos" w:eastAsia="Aptos" w:hAnsi="Aptos"/>
+          <w:sz w:val="22"/>
+          <w:szCs w:val="22"/>
         </w:rPr>
         <w:t xml:space="preserve">Money worries are a big cause of stress at work. Teaching staff about pay and pensions helps.</w:t>
       </w:r>
@@ -929,7 +928,7 @@
           <w:left w:val="single" w:color="DF5694" w:sz="24" w:space="4"/>
         </w:pBdr>
         <w:shd w:fill="FBE1EC" w:color="auto" w:val="clear"/>
-        <w:spacing w:after="20" w:before="40"/>
+        <w:spacing w:after="40" w:before="100"/>
         <w:ind w:left="120" w:right="120"/>
       </w:pPr>
       <w:r>
@@ -938,16 +937,16 @@
           <w:b/>
           <w:bCs/>
           <w:color w:val="3D315D"/>
-          <w:sz w:val="21"/>
-          <w:szCs w:val="21"/>
+          <w:sz w:val="22"/>
+          <w:szCs w:val="22"/>
         </w:rPr>
         <w:t xml:space="preserve">What this means for us: </w:t>
       </w:r>
       <w:r>
         <w:rPr>
           <w:rFonts w:ascii="Aptos" w:cs="Aptos" w:eastAsia="Aptos" w:hAnsi="Aptos"/>
-          <w:sz w:val="21"/>
-          <w:szCs w:val="21"/>
+          <w:sz w:val="22"/>
+          <w:szCs w:val="22"/>
         </w:rPr>
         <w:t xml:space="preserve">Payroll is in a strong position to help staff understand their pay and pensions.</w:t>
       </w:r>
@@ -958,7 +957,7 @@
         <w:pBdr>
           <w:bottom w:val="single" w:color="DF5694" w:sz="10" w:space="2"/>
         </w:pBdr>
-        <w:spacing w:after="30" w:before="140"/>
+        <w:spacing w:after="80" w:before="300"/>
       </w:pPr>
       <w:r>
         <w:rPr>
@@ -979,13 +978,13 @@
           <w:ilvl w:val="0"/>
           <w:numId w:val="2"/>
         </w:numPr>
-        <w:spacing w:after="10"/>
-      </w:pPr>
-      <w:r>
-        <w:rPr>
-          <w:rFonts w:ascii="Aptos" w:cs="Aptos" w:eastAsia="Aptos" w:hAnsi="Aptos"/>
-          <w:sz w:val="21"/>
-          <w:szCs w:val="21"/>
+        <w:spacing w:after="50"/>
+      </w:pPr>
+      <w:r>
+        <w:rPr>
+          <w:rFonts w:ascii="Aptos" w:cs="Aptos" w:eastAsia="Aptos" w:hAnsi="Aptos"/>
+          <w:sz w:val="22"/>
+          <w:szCs w:val="22"/>
         </w:rPr>
         <w:t xml:space="preserve">Change is a chance to improve, not only a problem.</w:t>
       </w:r>
@@ -997,206 +996,20 @@
           <w:ilvl w:val="0"/>
           <w:numId w:val="2"/>
         </w:numPr>
-        <w:spacing w:after="10"/>
-      </w:pPr>
-      <w:r>
-        <w:rPr>
-          <w:rFonts w:ascii="Aptos" w:cs="Aptos" w:eastAsia="Aptos" w:hAnsi="Aptos"/>
-          <w:sz w:val="21"/>
-          <w:szCs w:val="21"/>
+        <w:spacing w:after="50"/>
+      </w:pPr>
+      <w:r>
+        <w:rPr>
+          <w:rFonts w:ascii="Aptos" w:cs="Aptos" w:eastAsia="Aptos" w:hAnsi="Aptos"/>
+          <w:sz w:val="22"/>
+          <w:szCs w:val="22"/>
         </w:rPr>
         <w:t xml:space="preserve">MHR wants people, pay and finance to work together in one system by 2027.</w:t>
       </w:r>
     </w:p>
     <w:p>
       <w:pPr>
-        <w:shd w:fill="3D315D" w:color="auto" w:val="clear"/>
-        <w:spacing w:after="80" w:before="240"/>
-        <w:ind w:left="120" w:right="120"/>
-      </w:pPr>
-      <w:r>
-        <w:rPr>
-          <w:rFonts w:ascii="Aptos" w:cs="Aptos" w:eastAsia="Aptos" w:hAnsi="Aptos"/>
-          <w:b/>
-          <w:bCs/>
-          <w:color w:val="FFFFFF"/>
-          <w:sz w:val="26"/>
-          <w:szCs w:val="26"/>
-        </w:rPr>
-        <w:t xml:space="preserve">What we should do next</w:t>
-      </w:r>
-    </w:p>
-    <w:p>
-      <w:pPr>
-        <w:spacing w:after="40"/>
-      </w:pPr>
-      <w:r>
-        <w:rPr>
-          <w:rFonts w:ascii="Aptos" w:cs="Aptos" w:eastAsia="Aptos" w:hAnsi="Aptos"/>
-          <w:b/>
-          <w:bCs/>
-          <w:color w:val="3D315D"/>
-          <w:sz w:val="21"/>
-          <w:szCs w:val="21"/>
-        </w:rPr>
-        <w:t xml:space="preserve">1. Set clear rules for AI: </w:t>
-      </w:r>
-      <w:r>
-        <w:rPr>
-          <w:rFonts w:ascii="Aptos" w:cs="Aptos" w:eastAsia="Aptos" w:hAnsi="Aptos"/>
-          <w:sz w:val="21"/>
-          <w:szCs w:val="21"/>
-        </w:rPr>
-        <w:t xml:space="preserve">Agree which AI tools staff use and how we keep data safe.</w:t>
-      </w:r>
-    </w:p>
-    <w:p>
-      <w:pPr>
-        <w:spacing w:after="40"/>
-      </w:pPr>
-      <w:r>
-        <w:rPr>
-          <w:rFonts w:ascii="Aptos" w:cs="Aptos" w:eastAsia="Aptos" w:hAnsi="Aptos"/>
-          <w:b/>
-          <w:bCs/>
-          <w:color w:val="3D315D"/>
-          <w:sz w:val="21"/>
-          <w:szCs w:val="21"/>
-        </w:rPr>
-        <w:t xml:space="preserve">2. Try AI on one problem: </w:t>
-      </w:r>
-      <w:r>
-        <w:rPr>
-          <w:rFonts w:ascii="Aptos" w:cs="Aptos" w:eastAsia="Aptos" w:hAnsi="Aptos"/>
-          <w:sz w:val="21"/>
-          <w:szCs w:val="21"/>
-        </w:rPr>
-        <w:t xml:space="preserve">Pick one Payroll or HR task. Test AI on it. Agree what to do with the time saved.</w:t>
-      </w:r>
-    </w:p>
-    <w:p>
-      <w:pPr>
-        <w:spacing w:after="40"/>
-      </w:pPr>
-      <w:r>
-        <w:rPr>
-          <w:rFonts w:ascii="Aptos" w:cs="Aptos" w:eastAsia="Aptos" w:hAnsi="Aptos"/>
-          <w:b/>
-          <w:bCs/>
-          <w:color w:val="3D315D"/>
-          <w:sz w:val="21"/>
-          <w:szCs w:val="21"/>
-        </w:rPr>
-        <w:t xml:space="preserve">3. Teach AI basics: </w:t>
-      </w:r>
-      <w:r>
-        <w:rPr>
-          <w:rFonts w:ascii="Aptos" w:cs="Aptos" w:eastAsia="Aptos" w:hAnsi="Aptos"/>
-          <w:sz w:val="21"/>
-          <w:szCs w:val="21"/>
-        </w:rPr>
-        <w:t xml:space="preserve">Give all teams a short, simple AI course.</w:t>
-      </w:r>
-    </w:p>
-    <w:p>
-      <w:pPr>
-        <w:spacing w:after="40"/>
-      </w:pPr>
-      <w:r>
-        <w:rPr>
-          <w:rFonts w:ascii="Aptos" w:cs="Aptos" w:eastAsia="Aptos" w:hAnsi="Aptos"/>
-          <w:b/>
-          <w:bCs/>
-          <w:color w:val="3D315D"/>
-          <w:sz w:val="21"/>
-          <w:szCs w:val="21"/>
-        </w:rPr>
-        <w:t xml:space="preserve">4. Look at the new iTrent tools: </w:t>
-      </w:r>
-      <w:r>
-        <w:rPr>
-          <w:rFonts w:ascii="Aptos" w:cs="Aptos" w:eastAsia="Aptos" w:hAnsi="Aptos"/>
-          <w:sz w:val="21"/>
-          <w:szCs w:val="21"/>
-        </w:rPr>
-        <w:t xml:space="preserve">Ask MHR for a demo of the new tools.</w:t>
-      </w:r>
-    </w:p>
-    <w:p>
-      <w:pPr>
-        <w:spacing w:after="40"/>
-      </w:pPr>
-      <w:r>
-        <w:rPr>
-          <w:rFonts w:ascii="Aptos" w:cs="Aptos" w:eastAsia="Aptos" w:hAnsi="Aptos"/>
-          <w:b/>
-          <w:bCs/>
-          <w:color w:val="3D315D"/>
-          <w:sz w:val="21"/>
-          <w:szCs w:val="21"/>
-        </w:rPr>
-        <w:t xml:space="preserve">5. Welcome new ideas: </w:t>
-      </w:r>
-      <w:r>
-        <w:rPr>
-          <w:rFonts w:ascii="Aptos" w:cs="Aptos" w:eastAsia="Aptos" w:hAnsi="Aptos"/>
-          <w:sz w:val="21"/>
-          <w:szCs w:val="21"/>
-        </w:rPr>
-        <w:t xml:space="preserve">Managers ask staff what they have improved, and explain any no.</w:t>
-      </w:r>
-    </w:p>
-    <w:p>
-      <w:pPr>
-        <w:spacing w:after="40"/>
-      </w:pPr>
-      <w:r>
-        <w:rPr>
-          <w:rFonts w:ascii="Aptos" w:cs="Aptos" w:eastAsia="Aptos" w:hAnsi="Aptos"/>
-          <w:b/>
-          <w:bCs/>
-          <w:color w:val="3D315D"/>
-          <w:sz w:val="21"/>
-          <w:szCs w:val="21"/>
-        </w:rPr>
-        <w:t xml:space="preserve">6. Help staff with money: </w:t>
-      </w:r>
-      <w:r>
-        <w:rPr>
-          <w:rFonts w:ascii="Aptos" w:cs="Aptos" w:eastAsia="Aptos" w:hAnsi="Aptos"/>
-          <w:sz w:val="21"/>
-          <w:szCs w:val="21"/>
-        </w:rPr>
-        <w:t xml:space="preserve">Payroll runs short sessions on payslips and pensions.</w:t>
-      </w:r>
-    </w:p>
-    <w:p>
-      <w:pPr>
-        <w:spacing w:after="40"/>
-      </w:pPr>
-      <w:r>
-        <w:rPr>
-          <w:rFonts w:ascii="Aptos" w:cs="Aptos" w:eastAsia="Aptos" w:hAnsi="Aptos"/>
-          <w:b/>
-          <w:bCs/>
-          <w:color w:val="3D315D"/>
-          <w:sz w:val="21"/>
-          <w:szCs w:val="21"/>
-        </w:rPr>
-        <w:t xml:space="preserve">7. Support young people: </w:t>
-      </w:r>
-      <w:r>
-        <w:rPr>
-          <w:rFonts w:ascii="Aptos" w:cs="Aptos" w:eastAsia="Aptos" w:hAnsi="Aptos"/>
-          <w:sz w:val="21"/>
-          <w:szCs w:val="21"/>
-        </w:rPr>
-        <w:t xml:space="preserve">Look at apprenticeships and work experience.</w:t>
-      </w:r>
-    </w:p>
-    <w:p>
-      <w:pPr>
-        <w:spacing w:before="160"/>
+        <w:spacing w:before="300"/>
       </w:pPr>
       <w:r>
         <w:rPr>
@@ -1213,7 +1026,7 @@
     <w:sectPr>
       <w:footerReference w:type="default" r:id="rId7"/>
       <w:pgSz w:w="11906" w:h="16838" w:orient="portrait"/>
-      <w:pgMar w:top="800" w:right="900" w:bottom="800" w:left="900" w:header="708" w:footer="708" w:gutter="0"/>
+      <w:pgMar w:top="1000" w:right="1080" w:bottom="1000" w:left="1080" w:header="708" w:footer="708" w:gutter="0"/>
       <w:pgNumType/>
       <w:docGrid w:linePitch="360"/>
     </w:sectPr>
@@ -1452,11 +1265,15 @@
     <w:rPrDefault>
       <w:rPr>
         <w:rFonts w:ascii="Aptos" w:cs="Aptos" w:eastAsia="Aptos" w:hAnsi="Aptos"/>
-        <w:sz w:val="21"/>
-        <w:szCs w:val="21"/>
+        <w:sz w:val="22"/>
+        <w:szCs w:val="22"/>
       </w:rPr>
     </w:rPrDefault>
-    <w:pPrDefault/>
+    <w:pPrDefault>
+      <w:pPr>
+        <w:spacing w:line="276"/>
+      </w:pPr>
+    </w:pPrDefault>
   </w:docDefaults>
   <w:style w:type="paragraph" w:styleId="Title">
     <w:name w:val="Title"/>

</xml_diff>